<commit_message>
Trim the cross-document cross-reference notes (doc03 §3.3 / doc04 §4.3)
Shortened both mirrored notes to a single sentence pointing at the
other document, dropping the "oba dokumenty powinny dostać spójną
odpowiedź" commentary.

Co-Authored-By: Claude Sonnet 5 <noreply@anthropic.com>
</commit_message>
<xml_diff>
--- a/projekty/03_Procedura_zglaszania_nieprawidlowosci.docx
+++ b/projekty/03_Procedura_zglaszania_nieprawidlowosci.docx
@@ -174,16 +174,7 @@
     </w:p>
     <w:p>
       <w:r>
-        <w:t xml:space="preserve">3. Należy przewidzieć kanał dla zgłoszeń dotyczących całego Zarządu lub całej Rady [●] — </w:t>
-      </w:r>
-      <w:r>
-        <w:rPr>
-          <w:b/>
-        </w:rPr>
-        <w:t>to samo pytanie co w Procedurze skarg i wniosków</w:t>
-      </w:r>
-      <w:r>
-        <w:t xml:space="preserve"> § 4 ust. 3; oba dokumenty powinny dostać spójną odpowiedź.</w:t>
+        <w:t>3. Należy przewidzieć kanał dla zgłoszeń dotyczących całego Zarządu lub całej Rady [●] — to samo co w Procedurze skarg i wniosków § 4 ust. 3.</w:t>
       </w:r>
     </w:p>
     <w:p>

</xml_diff>